<commit_message>
Remove Section 3 (Mapping)
</commit_message>
<xml_diff>
--- a/Class Design.docx
+++ b/Class Design.docx
@@ -2117,345 +2117,6 @@
       </w:tr>
     </w:tbl>
     <w:p/>
-    <w:p>
-      <w:pPr>
-        <w:pStyle w:val="Heading1"/>
-      </w:pPr>
-      <w:r>
-        <w:t>3. Tổng hợp: Mapping phương thức với Functional Requirements</w:t>
-      </w:r>
-    </w:p>
-    <w:tbl>
-      <w:tblPr>
-        <w:tblStyle w:val="TableGrid"/>
-        <w:tblW w:w="0" w:type="auto"/>
-        <w:jc w:val="center"/>
-        <w:tblLook w:val="04A0" w:firstRow="1" w:lastRow="0" w:firstColumn="1" w:lastColumn="0" w:noHBand="0" w:noVBand="1"/>
-      </w:tblPr>
-      <w:tblGrid>
-        <w:gridCol w:w="2880"/>
-        <w:gridCol w:w="2880"/>
-        <w:gridCol w:w="2880"/>
-      </w:tblGrid>
-      <w:tr>
-        <w:trPr>
-          <w:jc w:val="center"/>
-        </w:trPr>
-        <w:tc>
-          <w:tcPr>
-            <w:tcW w:w="2880" w:type="dxa"/>
-          </w:tcPr>
-          <w:p>
-            <w:r>
-              <w:rPr>
-                <w:b/>
-                <w:sz w:val="24"/>
-              </w:rPr>
-              <w:t>Functional Requirement</w:t>
-            </w:r>
-          </w:p>
-        </w:tc>
-        <w:tc>
-          <w:tcPr>
-            <w:tcW w:w="2880" w:type="dxa"/>
-          </w:tcPr>
-          <w:p>
-            <w:r>
-              <w:rPr>
-                <w:b/>
-                <w:sz w:val="24"/>
-              </w:rPr>
-              <w:t>Phương thức tương ứng</w:t>
-            </w:r>
-          </w:p>
-        </w:tc>
-        <w:tc>
-          <w:tcPr>
-            <w:tcW w:w="2880" w:type="dxa"/>
-          </w:tcPr>
-          <w:p>
-            <w:r>
-              <w:rPr>
-                <w:b/>
-                <w:sz w:val="24"/>
-              </w:rPr>
-              <w:t>Class</w:t>
-            </w:r>
-          </w:p>
-        </w:tc>
-      </w:tr>
-      <w:tr>
-        <w:trPr>
-          <w:jc w:val="center"/>
-        </w:trPr>
-        <w:tc>
-          <w:tcPr>
-            <w:tcW w:w="2880" w:type="dxa"/>
-          </w:tcPr>
-          <w:p>
-            <w:r>
-              <w:rPr>
-                <w:sz w:val="24"/>
-              </w:rPr>
-              <w:t>FR1 - Init</w:t>
-            </w:r>
-          </w:p>
-        </w:tc>
-        <w:tc>
-          <w:tcPr>
-            <w:tcW w:w="2880" w:type="dxa"/>
-          </w:tcPr>
-          <w:p>
-            <w:r>
-              <w:rPr>
-                <w:sz w:val="24"/>
-              </w:rPr>
-              <w:t>BrowserHistory() (Constructor)</w:t>
-            </w:r>
-          </w:p>
-        </w:tc>
-        <w:tc>
-          <w:tcPr>
-            <w:tcW w:w="2880" w:type="dxa"/>
-          </w:tcPr>
-          <w:p>
-            <w:r>
-              <w:rPr>
-                <w:sz w:val="24"/>
-              </w:rPr>
-              <w:t>BrowserHistory</w:t>
-            </w:r>
-          </w:p>
-        </w:tc>
-      </w:tr>
-      <w:tr>
-        <w:trPr>
-          <w:jc w:val="center"/>
-        </w:trPr>
-        <w:tc>
-          <w:tcPr>
-            <w:tcW w:w="2880" w:type="dxa"/>
-          </w:tcPr>
-          <w:p>
-            <w:r>
-              <w:rPr>
-                <w:sz w:val="24"/>
-              </w:rPr>
-              <w:t>FR2 - Visit</w:t>
-            </w:r>
-          </w:p>
-        </w:tc>
-        <w:tc>
-          <w:tcPr>
-            <w:tcW w:w="2880" w:type="dxa"/>
-          </w:tcPr>
-          <w:p>
-            <w:r>
-              <w:rPr>
-                <w:sz w:val="24"/>
-              </w:rPr>
-              <w:t>visit(String url, String title)</w:t>
-            </w:r>
-          </w:p>
-        </w:tc>
-        <w:tc>
-          <w:tcPr>
-            <w:tcW w:w="2880" w:type="dxa"/>
-          </w:tcPr>
-          <w:p>
-            <w:r>
-              <w:rPr>
-                <w:sz w:val="24"/>
-              </w:rPr>
-              <w:t>BrowserHistory</w:t>
-            </w:r>
-          </w:p>
-        </w:tc>
-      </w:tr>
-      <w:tr>
-        <w:trPr>
-          <w:jc w:val="center"/>
-        </w:trPr>
-        <w:tc>
-          <w:tcPr>
-            <w:tcW w:w="2880" w:type="dxa"/>
-          </w:tcPr>
-          <w:p>
-            <w:r>
-              <w:rPr>
-                <w:sz w:val="24"/>
-              </w:rPr>
-              <w:t>FR3 - Backward</w:t>
-            </w:r>
-          </w:p>
-        </w:tc>
-        <w:tc>
-          <w:tcPr>
-            <w:tcW w:w="2880" w:type="dxa"/>
-          </w:tcPr>
-          <w:p>
-            <w:r>
-              <w:rPr>
-                <w:sz w:val="24"/>
-              </w:rPr>
-              <w:t>back()</w:t>
-            </w:r>
-          </w:p>
-        </w:tc>
-        <w:tc>
-          <w:tcPr>
-            <w:tcW w:w="2880" w:type="dxa"/>
-          </w:tcPr>
-          <w:p>
-            <w:r>
-              <w:rPr>
-                <w:sz w:val="24"/>
-              </w:rPr>
-              <w:t>BrowserHistory</w:t>
-            </w:r>
-          </w:p>
-        </w:tc>
-      </w:tr>
-      <w:tr>
-        <w:trPr>
-          <w:jc w:val="center"/>
-        </w:trPr>
-        <w:tc>
-          <w:tcPr>
-            <w:tcW w:w="2880" w:type="dxa"/>
-          </w:tcPr>
-          <w:p>
-            <w:r>
-              <w:rPr>
-                <w:sz w:val="24"/>
-              </w:rPr>
-              <w:t>FR4 - Forward</w:t>
-            </w:r>
-          </w:p>
-        </w:tc>
-        <w:tc>
-          <w:tcPr>
-            <w:tcW w:w="2880" w:type="dxa"/>
-          </w:tcPr>
-          <w:p>
-            <w:r>
-              <w:rPr>
-                <w:sz w:val="24"/>
-              </w:rPr>
-              <w:t>forward()</w:t>
-            </w:r>
-          </w:p>
-        </w:tc>
-        <w:tc>
-          <w:tcPr>
-            <w:tcW w:w="2880" w:type="dxa"/>
-          </w:tcPr>
-          <w:p>
-            <w:r>
-              <w:rPr>
-                <w:sz w:val="24"/>
-              </w:rPr>
-              <w:t>BrowserHistory</w:t>
-            </w:r>
-          </w:p>
-        </w:tc>
-      </w:tr>
-      <w:tr>
-        <w:trPr>
-          <w:jc w:val="center"/>
-        </w:trPr>
-        <w:tc>
-          <w:tcPr>
-            <w:tcW w:w="2880" w:type="dxa"/>
-          </w:tcPr>
-          <w:p>
-            <w:r>
-              <w:rPr>
-                <w:sz w:val="24"/>
-              </w:rPr>
-              <w:t>FR5 - Show History</w:t>
-            </w:r>
-          </w:p>
-        </w:tc>
-        <w:tc>
-          <w:tcPr>
-            <w:tcW w:w="2880" w:type="dxa"/>
-          </w:tcPr>
-          <w:p>
-            <w:r>
-              <w:rPr>
-                <w:sz w:val="24"/>
-              </w:rPr>
-              <w:t>showHistory()</w:t>
-            </w:r>
-          </w:p>
-        </w:tc>
-        <w:tc>
-          <w:tcPr>
-            <w:tcW w:w="2880" w:type="dxa"/>
-          </w:tcPr>
-          <w:p>
-            <w:r>
-              <w:rPr>
-                <w:sz w:val="24"/>
-              </w:rPr>
-              <w:t>BrowserHistory</w:t>
-            </w:r>
-          </w:p>
-        </w:tc>
-      </w:tr>
-      <w:tr>
-        <w:trPr>
-          <w:jc w:val="center"/>
-        </w:trPr>
-        <w:tc>
-          <w:tcPr>
-            <w:tcW w:w="2880" w:type="dxa"/>
-          </w:tcPr>
-          <w:p>
-            <w:r>
-              <w:rPr>
-                <w:sz w:val="24"/>
-              </w:rPr>
-              <w:t>NFR - Memory Management</w:t>
-            </w:r>
-          </w:p>
-        </w:tc>
-        <w:tc>
-          <w:tcPr>
-            <w:tcW w:w="2880" w:type="dxa"/>
-          </w:tcPr>
-          <w:p>
-            <w:r>
-              <w:rPr>
-                <w:sz w:val="24"/>
-              </w:rPr>
-              <w:t>truncateForward()</w:t>
-            </w:r>
-          </w:p>
-        </w:tc>
-        <w:tc>
-          <w:tcPr>
-            <w:tcW w:w="2880" w:type="dxa"/>
-          </w:tcPr>
-          <w:p>
-            <w:r>
-              <w:rPr>
-                <w:sz w:val="24"/>
-              </w:rPr>
-              <w:t>BrowserHistory</w:t>
-            </w:r>
-          </w:p>
-        </w:tc>
-      </w:tr>
-    </w:tbl>
-    <w:p/>
-    <w:sectPr>
-      <w:pgSz w:w="12240" w:h="15840"/>
-      <w:pgMar w:top="1440" w:right="1800" w:bottom="1440" w:left="1800" w:header="720" w:footer="720" w:gutter="0"/>
-      <w:cols w:space="720"/>
-      <w:docGrid w:linePitch="360"/>
-    </w:sectPr>
   </w:body>
 </w:document>
 </file>

</xml_diff>

<commit_message>
Remove Section 3 from Class Design files
</commit_message>
<xml_diff>
--- a/Class Design.docx
+++ b/Class Design.docx
@@ -2117,345 +2117,6 @@
       </w:tr>
     </w:tbl>
     <w:p/>
-    <w:p>
-      <w:pPr>
-        <w:pStyle w:val="Heading1"/>
-      </w:pPr>
-      <w:r>
-        <w:t>3. Tổng hợp: Mapping phương thức với Functional Requirements</w:t>
-      </w:r>
-    </w:p>
-    <w:tbl>
-      <w:tblPr>
-        <w:tblStyle w:val="TableGrid"/>
-        <w:tblW w:w="0" w:type="auto"/>
-        <w:jc w:val="center"/>
-        <w:tblLook w:val="04A0" w:firstRow="1" w:lastRow="0" w:firstColumn="1" w:lastColumn="0" w:noHBand="0" w:noVBand="1"/>
-      </w:tblPr>
-      <w:tblGrid>
-        <w:gridCol w:w="2880"/>
-        <w:gridCol w:w="2880"/>
-        <w:gridCol w:w="2880"/>
-      </w:tblGrid>
-      <w:tr>
-        <w:trPr>
-          <w:jc w:val="center"/>
-        </w:trPr>
-        <w:tc>
-          <w:tcPr>
-            <w:tcW w:w="2880" w:type="dxa"/>
-          </w:tcPr>
-          <w:p>
-            <w:r>
-              <w:rPr>
-                <w:b/>
-                <w:sz w:val="24"/>
-              </w:rPr>
-              <w:t>Functional Requirement</w:t>
-            </w:r>
-          </w:p>
-        </w:tc>
-        <w:tc>
-          <w:tcPr>
-            <w:tcW w:w="2880" w:type="dxa"/>
-          </w:tcPr>
-          <w:p>
-            <w:r>
-              <w:rPr>
-                <w:b/>
-                <w:sz w:val="24"/>
-              </w:rPr>
-              <w:t>Phương thức tương ứng</w:t>
-            </w:r>
-          </w:p>
-        </w:tc>
-        <w:tc>
-          <w:tcPr>
-            <w:tcW w:w="2880" w:type="dxa"/>
-          </w:tcPr>
-          <w:p>
-            <w:r>
-              <w:rPr>
-                <w:b/>
-                <w:sz w:val="24"/>
-              </w:rPr>
-              <w:t>Class</w:t>
-            </w:r>
-          </w:p>
-        </w:tc>
-      </w:tr>
-      <w:tr>
-        <w:trPr>
-          <w:jc w:val="center"/>
-        </w:trPr>
-        <w:tc>
-          <w:tcPr>
-            <w:tcW w:w="2880" w:type="dxa"/>
-          </w:tcPr>
-          <w:p>
-            <w:r>
-              <w:rPr>
-                <w:sz w:val="24"/>
-              </w:rPr>
-              <w:t>FR1 - Init</w:t>
-            </w:r>
-          </w:p>
-        </w:tc>
-        <w:tc>
-          <w:tcPr>
-            <w:tcW w:w="2880" w:type="dxa"/>
-          </w:tcPr>
-          <w:p>
-            <w:r>
-              <w:rPr>
-                <w:sz w:val="24"/>
-              </w:rPr>
-              <w:t>BrowserHistory() (Constructor)</w:t>
-            </w:r>
-          </w:p>
-        </w:tc>
-        <w:tc>
-          <w:tcPr>
-            <w:tcW w:w="2880" w:type="dxa"/>
-          </w:tcPr>
-          <w:p>
-            <w:r>
-              <w:rPr>
-                <w:sz w:val="24"/>
-              </w:rPr>
-              <w:t>BrowserHistory</w:t>
-            </w:r>
-          </w:p>
-        </w:tc>
-      </w:tr>
-      <w:tr>
-        <w:trPr>
-          <w:jc w:val="center"/>
-        </w:trPr>
-        <w:tc>
-          <w:tcPr>
-            <w:tcW w:w="2880" w:type="dxa"/>
-          </w:tcPr>
-          <w:p>
-            <w:r>
-              <w:rPr>
-                <w:sz w:val="24"/>
-              </w:rPr>
-              <w:t>FR2 - Visit</w:t>
-            </w:r>
-          </w:p>
-        </w:tc>
-        <w:tc>
-          <w:tcPr>
-            <w:tcW w:w="2880" w:type="dxa"/>
-          </w:tcPr>
-          <w:p>
-            <w:r>
-              <w:rPr>
-                <w:sz w:val="24"/>
-              </w:rPr>
-              <w:t>visit(String url, String title)</w:t>
-            </w:r>
-          </w:p>
-        </w:tc>
-        <w:tc>
-          <w:tcPr>
-            <w:tcW w:w="2880" w:type="dxa"/>
-          </w:tcPr>
-          <w:p>
-            <w:r>
-              <w:rPr>
-                <w:sz w:val="24"/>
-              </w:rPr>
-              <w:t>BrowserHistory</w:t>
-            </w:r>
-          </w:p>
-        </w:tc>
-      </w:tr>
-      <w:tr>
-        <w:trPr>
-          <w:jc w:val="center"/>
-        </w:trPr>
-        <w:tc>
-          <w:tcPr>
-            <w:tcW w:w="2880" w:type="dxa"/>
-          </w:tcPr>
-          <w:p>
-            <w:r>
-              <w:rPr>
-                <w:sz w:val="24"/>
-              </w:rPr>
-              <w:t>FR3 - Backward</w:t>
-            </w:r>
-          </w:p>
-        </w:tc>
-        <w:tc>
-          <w:tcPr>
-            <w:tcW w:w="2880" w:type="dxa"/>
-          </w:tcPr>
-          <w:p>
-            <w:r>
-              <w:rPr>
-                <w:sz w:val="24"/>
-              </w:rPr>
-              <w:t>back()</w:t>
-            </w:r>
-          </w:p>
-        </w:tc>
-        <w:tc>
-          <w:tcPr>
-            <w:tcW w:w="2880" w:type="dxa"/>
-          </w:tcPr>
-          <w:p>
-            <w:r>
-              <w:rPr>
-                <w:sz w:val="24"/>
-              </w:rPr>
-              <w:t>BrowserHistory</w:t>
-            </w:r>
-          </w:p>
-        </w:tc>
-      </w:tr>
-      <w:tr>
-        <w:trPr>
-          <w:jc w:val="center"/>
-        </w:trPr>
-        <w:tc>
-          <w:tcPr>
-            <w:tcW w:w="2880" w:type="dxa"/>
-          </w:tcPr>
-          <w:p>
-            <w:r>
-              <w:rPr>
-                <w:sz w:val="24"/>
-              </w:rPr>
-              <w:t>FR4 - Forward</w:t>
-            </w:r>
-          </w:p>
-        </w:tc>
-        <w:tc>
-          <w:tcPr>
-            <w:tcW w:w="2880" w:type="dxa"/>
-          </w:tcPr>
-          <w:p>
-            <w:r>
-              <w:rPr>
-                <w:sz w:val="24"/>
-              </w:rPr>
-              <w:t>forward()</w:t>
-            </w:r>
-          </w:p>
-        </w:tc>
-        <w:tc>
-          <w:tcPr>
-            <w:tcW w:w="2880" w:type="dxa"/>
-          </w:tcPr>
-          <w:p>
-            <w:r>
-              <w:rPr>
-                <w:sz w:val="24"/>
-              </w:rPr>
-              <w:t>BrowserHistory</w:t>
-            </w:r>
-          </w:p>
-        </w:tc>
-      </w:tr>
-      <w:tr>
-        <w:trPr>
-          <w:jc w:val="center"/>
-        </w:trPr>
-        <w:tc>
-          <w:tcPr>
-            <w:tcW w:w="2880" w:type="dxa"/>
-          </w:tcPr>
-          <w:p>
-            <w:r>
-              <w:rPr>
-                <w:sz w:val="24"/>
-              </w:rPr>
-              <w:t>FR5 - Show History</w:t>
-            </w:r>
-          </w:p>
-        </w:tc>
-        <w:tc>
-          <w:tcPr>
-            <w:tcW w:w="2880" w:type="dxa"/>
-          </w:tcPr>
-          <w:p>
-            <w:r>
-              <w:rPr>
-                <w:sz w:val="24"/>
-              </w:rPr>
-              <w:t>showHistory()</w:t>
-            </w:r>
-          </w:p>
-        </w:tc>
-        <w:tc>
-          <w:tcPr>
-            <w:tcW w:w="2880" w:type="dxa"/>
-          </w:tcPr>
-          <w:p>
-            <w:r>
-              <w:rPr>
-                <w:sz w:val="24"/>
-              </w:rPr>
-              <w:t>BrowserHistory</w:t>
-            </w:r>
-          </w:p>
-        </w:tc>
-      </w:tr>
-      <w:tr>
-        <w:trPr>
-          <w:jc w:val="center"/>
-        </w:trPr>
-        <w:tc>
-          <w:tcPr>
-            <w:tcW w:w="2880" w:type="dxa"/>
-          </w:tcPr>
-          <w:p>
-            <w:r>
-              <w:rPr>
-                <w:sz w:val="24"/>
-              </w:rPr>
-              <w:t>NFR - Memory Management</w:t>
-            </w:r>
-          </w:p>
-        </w:tc>
-        <w:tc>
-          <w:tcPr>
-            <w:tcW w:w="2880" w:type="dxa"/>
-          </w:tcPr>
-          <w:p>
-            <w:r>
-              <w:rPr>
-                <w:sz w:val="24"/>
-              </w:rPr>
-              <w:t>truncateForward()</w:t>
-            </w:r>
-          </w:p>
-        </w:tc>
-        <w:tc>
-          <w:tcPr>
-            <w:tcW w:w="2880" w:type="dxa"/>
-          </w:tcPr>
-          <w:p>
-            <w:r>
-              <w:rPr>
-                <w:sz w:val="24"/>
-              </w:rPr>
-              <w:t>BrowserHistory</w:t>
-            </w:r>
-          </w:p>
-        </w:tc>
-      </w:tr>
-    </w:tbl>
-    <w:p/>
-    <w:sectPr>
-      <w:pgSz w:w="12240" w:h="15840"/>
-      <w:pgMar w:top="1440" w:right="1800" w:bottom="1440" w:left="1800" w:header="720" w:footer="720" w:gutter="0"/>
-      <w:cols w:space="720"/>
-      <w:docGrid w:linePitch="360"/>
-    </w:sectPr>
   </w:body>
 </w:document>
 </file>

</xml_diff>

<commit_message>
Fix ASCII diagram formatting
</commit_message>
<xml_diff>
--- a/Class Design.docx
+++ b/Class Design.docx
@@ -33,6 +33,9 @@
     </w:p>
     <w:p>
       <w:r>
+        <w:rPr>
+          <w:rFonts w:ascii="Courier New" w:hAnsi="Courier New" w:eastAsia="Courier New"/>
+        </w:rPr>
         <w:t>[prev] &lt;--- | url | title | timestamp | ---&gt; [next]</w:t>
       </w:r>
     </w:p>
@@ -355,14 +358,22 @@
       </w:r>
     </w:p>
     <w:p>
+      <w:pPr>
+        <w:keepNext/>
+        <w:keepLines/>
+      </w:pPr>
       <w:r>
-        <w:t xml:space="preserve">  head                     current                 tail</w:t>
+        <w:rPr>
+          <w:rFonts w:ascii="Consolas" w:hAnsi="Consolas" w:eastAsia="Consolas"/>
+          <w:sz w:val="20"/>
+        </w:rPr>
+        <w:t xml:space="preserve"> head                     current                 tail</w:t>
         <w:br/>
-        <w:t xml:space="preserve">   |                          |                      |</w:t>
+        <w:t xml:space="preserve">  |                          |                      |</w:t>
         <w:br/>
-        <w:t xml:space="preserve">   v                          v                      v</w:t>
+        <w:t xml:space="preserve">  v                          v                      v</w:t>
         <w:br/>
-        <w:t xml:space="preserve"> [Google] &lt;=&gt; [YouTube] &lt;=&gt; [GitHub] &lt;=&gt; [Facebook] &lt;=&gt; [Reddit]</w:t>
+        <w:t>[Google] &lt;=&gt; [YouTube] &lt;=&gt; [GitHub] &lt;=&gt; [Facebook] &lt;=&gt; [Reddit]</w:t>
       </w:r>
     </w:p>
     <w:p>

</xml_diff>